<commit_message>
funkcionalnosti i primer koriscenja
</commit_message>
<xml_diff>
--- a/docs/diplomski-rad/Diplomski-rad.docx
+++ b/docs/diplomski-rad/Diplomski-rad.docx
@@ -3589,6 +3589,648 @@
     <w:p>
       <w:pPr>
         <w:pStyle w:val="Osnovnitekst"/>
+      </w:pPr>
+      <w:r>
+        <w:rPr>
+          <w:lang w:val="sr-Latn-RS"/>
+        </w:rPr>
+        <w:t>Primeri programa i kratka dokumentacija instrukcija izdvojeni su u posebne module. Oni dopunjuju interfejs, ali ne određuju pravila parsera, asemblera ili procesora. Time se razdvajaju prikaz, sadržaj namenjen korisniku i izvršna logika, a način korišćenja celog rešenja može zasebno da se prikaže u narednom poglavlju.</w:t>
+      </w:r>
+    </w:p>
+    <w:p>
+      <w:pPr>
+        <w:pStyle w:val="Poglavlje1"/>
+        <w:pageBreakBefore/>
+        <w:keepNext/>
+      </w:pPr>
+      <w:r>
+        <w:rPr>
+          <w:lang w:val="sr-Latn-RS"/>
+        </w:rPr>
+        <w:t>Funkcionalnosti i primer korišćenja</w:t>
+      </w:r>
+    </w:p>
+    <w:p>
+      <w:pPr>
+        <w:pStyle w:val="Osnovnitekst"/>
+        <w:keepLines/>
+      </w:pPr>
+      <w:r>
+        <w:rPr>
+          <w:lang w:val="sr-Latn-RS"/>
+        </w:rPr>
+        <w:t>Rad aplikacije prikazan je kroz ugrađeni primer „Zbir brojeva 1-5”. Isti program koristi se za unos, izvršavanje pojedinačnih instrukcija, zaustavljanje na tački prekida i proveru konačnog rezultata. Na kraju je jedna instrukcija namerno izmenjena kako bi se pokazalo prijavljivanje greške pri asembliranju.</w:t>
+      </w:r>
+    </w:p>
+    <w:p>
+      <w:pPr>
+        <w:pStyle w:val="Poglavlje2"/>
+        <w:keepNext/>
+      </w:pPr>
+      <w:r>
+        <w:rPr>
+          <w:lang w:val="sr-Latn-RS"/>
+        </w:rPr>
+        <w:t>Izgled aplikacije i režimi rada</w:t>
+      </w:r>
+    </w:p>
+    <w:p>
+      <w:pPr>
+        <w:pStyle w:val="Osnovnitekst"/>
+        <w:keepLines/>
+      </w:pPr>
+      <w:r>
+        <w:rPr>
+          <w:lang w:val="sr-Latn-RS"/>
+        </w:rPr>
+        <w:t>Levi deo radne površine namenjen je programu, a desni panelima REGISTRI i MEMORIJA. Ispod njih nalaze se kontrole izvršavanja i poruka o trenutnom stanju. Padajući meni omogućava izbor ugrađenih primera, dok dugme Dokumentacija otvara pregled podržanih instrukcija i njihovih formata.</w:t>
+      </w:r>
+    </w:p>
+    <w:p>
+      <w:pPr>
+        <w:pStyle w:val="Osnovnitekst"/>
+      </w:pPr>
+      <w:r>
+        <w:rPr>
+          <w:lang w:val="sr-Latn-RS"/>
+        </w:rPr>
+        <w:t>U režimu pisanja korisnik uređuje tekst ili bira primer. Posle uspešnog asembliranja prelazi se u režim izvršavanja, u kome se izvorni kod prikazuje sa brojevima linija i oznakama, bez mogućnosti neposrednog uređivanja. Za povratak u editor koristi se dugme Izmeni.</w:t>
+      </w:r>
+    </w:p>
+    <w:p>
+      <w:pPr>
+        <w:pStyle w:val="Poglavlje2"/>
+        <w:keepNext/>
+      </w:pPr>
+      <w:r>
+        <w:rPr>
+          <w:lang w:val="sr-Latn-RS"/>
+        </w:rPr>
+        <w:t>Unos i asembliranje programa</w:t>
+      </w:r>
+    </w:p>
+    <w:p>
+      <w:pPr>
+        <w:pStyle w:val="Osnovnitekst"/>
+        <w:keepNext/>
+        <w:keepLines/>
+      </w:pPr>
+      <w:r>
+        <w:rPr>
+          <w:lang w:val="sr-Latn-RS"/>
+        </w:rPr>
+        <w:t xml:space="preserve">Izborom stavke „Zbir brojeva 1-5” učitava se program prikazan na Slici </w:t>
+      </w:r>
+      <w:fldSimple w:instr=" REF Demo_input \h ">
+        <w:r>
+          <w:t>3</w:t>
+        </w:r>
+      </w:fldSimple>
+      <w:r>
+        <w:t xml:space="preserve">. Registar x1 čuva zbir, x2 brojač, a x3 granicu 6. Petlja dodaje vrednosti od 1 do 5, nakon čega se rezultat instrukcijom SW upisuje na adresu 0.</w:t>
+      </w:r>
+    </w:p>
+    <w:p>
+      <w:pPr>
+        <w:pStyle w:val="Osnovnitekstneuvuen"/>
+        <w:jc w:val="center"/>
+        <w:keepNext/>
+      </w:pPr>
+      <w:r>
+        <w:rPr>
+          <w:lang w:val="sr-Latn-RS"/>
+        </w:rPr>
+        <w:t/>
+      </w:r>
+      <w:r>
+        <w:drawing>
+          <wp:inline xmlns:a="http://schemas.openxmlformats.org/drawingml/2006/main" xmlns:pic="http://schemas.openxmlformats.org/drawingml/2006/picture">
+            <wp:extent cx="6048248" cy="2721712"/>
+            <wp:docPr id="803" name="Picture 803"/>
+            <wp:cNvGraphicFramePr>
+              <a:graphicFrameLocks noChangeAspect="1"/>
+            </wp:cNvGraphicFramePr>
+            <a:graphic>
+              <a:graphicData uri="http://schemas.openxmlformats.org/drawingml/2006/picture">
+                <pic:pic>
+                  <pic:nvPicPr>
+                    <pic:cNvPr id="0" name="primer-unos.png"/>
+                    <pic:cNvPicPr/>
+                  </pic:nvPicPr>
+                  <pic:blipFill>
+                    <a:blip r:embed="rIdThesisDemo3"/>
+                    <a:stretch>
+                      <a:fillRect/>
+                    </a:stretch>
+                  </pic:blipFill>
+                  <pic:spPr>
+                    <a:xfrm>
+                      <a:off x="0" y="0"/>
+                      <a:ext cx="6048248" cy="2721712"/>
+                    </a:xfrm>
+                    <a:prstGeom prst="rect"/>
+                  </pic:spPr>
+                </pic:pic>
+              </a:graphicData>
+            </a:graphic>
+          </wp:inline>
+        </w:drawing>
+      </w:r>
+    </w:p>
+    <w:p>
+      <w:pPr>
+        <w:pStyle w:val="Natpis"/>
+        <w:keepLines/>
+      </w:pPr>
+      <w:r>
+        <w:rPr>
+          <w:lang w:val="sr-Latn-RS"/>
+        </w:rPr>
+        <w:t/>
+      </w:r>
+      <w:r>
+        <w:t xml:space="preserve">Slika </w:t>
+      </w:r>
+      <w:bookmarkStart w:id="603" w:name="Demo_input"/>
+      <w:fldSimple w:instr=" SEQ Slika \* ARABIC ">
+        <w:r>
+          <w:t>3</w:t>
+        </w:r>
+      </w:fldSimple>
+      <w:bookmarkEnd w:id="603"/>
+      <w:r>
+        <w:t xml:space="preserve">. Primer sabiranja u režimu pisanja</w:t>
+      </w:r>
+    </w:p>
+    <w:p>
+      <w:pPr>
+        <w:pStyle w:val="Osnovnitekst"/>
+      </w:pPr>
+      <w:r>
+        <w:rPr>
+          <w:lang w:val="sr-Latn-RS"/>
+        </w:rPr>
+        <w:t>Pritiskom na Asembliraj proverava se uneti program. Ako nema grešaka, omogućavaju se Step i Run, a marker &gt; postavlja se na liniju 2, koja sadrži prvu instrukciju LI x1, 0. Registri i memorija još nisu prikazani kao korišćeni, pošto nijedna instrukcija nije izvršena.</w:t>
+      </w:r>
+    </w:p>
+    <w:p>
+      <w:pPr>
+        <w:pStyle w:val="Poglavlje2"/>
+        <w:keepNext/>
+      </w:pPr>
+      <w:r>
+        <w:rPr>
+          <w:lang w:val="sr-Latn-RS"/>
+        </w:rPr>
+        <w:t>Izvršavanje korak po korak</w:t>
+      </w:r>
+    </w:p>
+    <w:p>
+      <w:pPr>
+        <w:pStyle w:val="Osnovnitekst"/>
+        <w:keepLines/>
+      </w:pPr>
+      <w:r>
+        <w:rPr>
+          <w:lang w:val="sr-Latn-RS"/>
+        </w:rPr>
+        <w:t>Prva tri pritiska na Step postavljaju x1 na 0, x2 na 1 i x3 na 6. Marker zatim pokazuje liniju 7, sa prvom instrukcijom tela petlje. Komentari, prazni redovi i samostalna labela petlja ne predstavljaju posebne korake izvršavanja.</w:t>
+      </w:r>
+    </w:p>
+    <w:p>
+      <w:pPr>
+        <w:pStyle w:val="Osnovnitekst"/>
+        <w:keepNext/>
+        <w:keepLines/>
+      </w:pPr>
+      <w:r>
+        <w:rPr>
+          <w:lang w:val="sr-Latn-RS"/>
+        </w:rPr>
+        <w:t xml:space="preserve">Četvrti Step izvršava ADD x1, x1, x2 i menja zbir na 1. Stanje je prikazano na Slici </w:t>
+      </w:r>
+      <w:fldSimple w:instr=" REF Demo_step \h ">
+        <w:r>
+          <w:t>4</w:t>
+        </w:r>
+      </w:fldSimple>
+      <w:r>
+        <w:t xml:space="preserve">: x1 i x2 imaju vrednost 1, x3 ostaje 6, a memorija još nije menjana. Marker je na liniji 8 jer označava sledeću instrukciju, dok je promenjena vrednost registra x1 vizuelno istaknuta.</w:t>
+      </w:r>
+    </w:p>
+    <w:p>
+      <w:pPr>
+        <w:pStyle w:val="Osnovnitekstneuvuen"/>
+        <w:jc w:val="center"/>
+        <w:keepNext/>
+      </w:pPr>
+      <w:r>
+        <w:rPr>
+          <w:lang w:val="sr-Latn-RS"/>
+        </w:rPr>
+        <w:t/>
+      </w:r>
+      <w:r>
+        <w:drawing>
+          <wp:inline xmlns:a="http://schemas.openxmlformats.org/drawingml/2006/main" xmlns:pic="http://schemas.openxmlformats.org/drawingml/2006/picture">
+            <wp:extent cx="6048248" cy="2721712"/>
+            <wp:docPr id="804" name="Picture 804"/>
+            <wp:cNvGraphicFramePr>
+              <a:graphicFrameLocks noChangeAspect="1"/>
+            </wp:cNvGraphicFramePr>
+            <a:graphic>
+              <a:graphicData uri="http://schemas.openxmlformats.org/drawingml/2006/picture">
+                <pic:pic>
+                  <pic:nvPicPr>
+                    <pic:cNvPr id="0" name="primer-step.png"/>
+                    <pic:cNvPicPr/>
+                  </pic:nvPicPr>
+                  <pic:blipFill>
+                    <a:blip r:embed="rIdThesisDemo4"/>
+                    <a:stretch>
+                      <a:fillRect/>
+                    </a:stretch>
+                  </pic:blipFill>
+                  <pic:spPr>
+                    <a:xfrm>
+                      <a:off x="0" y="0"/>
+                      <a:ext cx="6048248" cy="2721712"/>
+                    </a:xfrm>
+                    <a:prstGeom prst="rect"/>
+                  </pic:spPr>
+                </pic:pic>
+              </a:graphicData>
+            </a:graphic>
+          </wp:inline>
+        </w:drawing>
+      </w:r>
+    </w:p>
+    <w:p>
+      <w:pPr>
+        <w:pStyle w:val="Natpis"/>
+        <w:keepLines/>
+      </w:pPr>
+      <w:r>
+        <w:rPr>
+          <w:lang w:val="sr-Latn-RS"/>
+        </w:rPr>
+        <w:t/>
+      </w:r>
+      <w:r>
+        <w:t xml:space="preserve">Slika </w:t>
+      </w:r>
+      <w:bookmarkStart w:id="604" w:name="Demo_step"/>
+      <w:fldSimple w:instr=" SEQ Slika \* ARABIC ">
+        <w:r>
+          <w:t>4</w:t>
+        </w:r>
+      </w:fldSimple>
+      <w:bookmarkEnd w:id="604"/>
+      <w:r>
+        <w:t xml:space="preserve">. Stanje posle četiri koraka izvršavanja</w:t>
+      </w:r>
+    </w:p>
+    <w:p>
+      <w:pPr>
+        <w:pStyle w:val="Poglavlje2"/>
+        <w:keepNext/>
+      </w:pPr>
+      <w:r>
+        <w:rPr>
+          <w:lang w:val="sr-Latn-RS"/>
+        </w:rPr>
+        <w:t>Run, breakpointi i Reset</w:t>
+      </w:r>
+    </w:p>
+    <w:p>
+      <w:pPr>
+        <w:pStyle w:val="Osnovnitekst"/>
+        <w:keepNext/>
+        <w:keepLines/>
+      </w:pPr>
+      <w:r>
+        <w:rPr>
+          <w:lang w:val="sr-Latn-RS"/>
+        </w:rPr>
+        <w:t xml:space="preserve">Posle četvrtog koraka klikom na izvršivu liniju 7 postavlja se tačka prekida, označena crvenom tačkom. Run nastavlja od linije 8, povećava brojač i izvršava grananje nazad ka petlji. Program se zaustavlja pre narednog sabiranja: x1 je 1, x2 je 2, a x3 je 6, kao na Slici </w:t>
+      </w:r>
+      <w:fldSimple w:instr=" REF Demo_breakpoint \h ">
+        <w:r>
+          <w:t>5</w:t>
+        </w:r>
+      </w:fldSimple>
+      <w:r>
+        <w:t xml:space="preserve">.</w:t>
+      </w:r>
+    </w:p>
+    <w:p>
+      <w:pPr>
+        <w:pStyle w:val="Osnovnitekstneuvuen"/>
+        <w:jc w:val="center"/>
+        <w:keepNext/>
+      </w:pPr>
+      <w:r>
+        <w:rPr>
+          <w:lang w:val="sr-Latn-RS"/>
+        </w:rPr>
+        <w:t/>
+      </w:r>
+      <w:r>
+        <w:drawing>
+          <wp:inline xmlns:a="http://schemas.openxmlformats.org/drawingml/2006/main" xmlns:pic="http://schemas.openxmlformats.org/drawingml/2006/picture">
+            <wp:extent cx="6048248" cy="2721712"/>
+            <wp:docPr id="805" name="Picture 805"/>
+            <wp:cNvGraphicFramePr>
+              <a:graphicFrameLocks noChangeAspect="1"/>
+            </wp:cNvGraphicFramePr>
+            <a:graphic>
+              <a:graphicData uri="http://schemas.openxmlformats.org/drawingml/2006/picture">
+                <pic:pic>
+                  <pic:nvPicPr>
+                    <pic:cNvPr id="0" name="primer-breakpoint.png"/>
+                    <pic:cNvPicPr/>
+                  </pic:nvPicPr>
+                  <pic:blipFill>
+                    <a:blip r:embed="rIdThesisDemo5"/>
+                    <a:stretch>
+                      <a:fillRect/>
+                    </a:stretch>
+                  </pic:blipFill>
+                  <pic:spPr>
+                    <a:xfrm>
+                      <a:off x="0" y="0"/>
+                      <a:ext cx="6048248" cy="2721712"/>
+                    </a:xfrm>
+                    <a:prstGeom prst="rect"/>
+                  </pic:spPr>
+                </pic:pic>
+              </a:graphicData>
+            </a:graphic>
+          </wp:inline>
+        </w:drawing>
+      </w:r>
+    </w:p>
+    <w:p>
+      <w:pPr>
+        <w:pStyle w:val="Natpis"/>
+        <w:keepLines/>
+      </w:pPr>
+      <w:r>
+        <w:rPr>
+          <w:lang w:val="sr-Latn-RS"/>
+        </w:rPr>
+        <w:t/>
+      </w:r>
+      <w:r>
+        <w:t xml:space="preserve">Slika </w:t>
+      </w:r>
+      <w:bookmarkStart w:id="605" w:name="Demo_breakpoint"/>
+      <w:fldSimple w:instr=" SEQ Slika \* ARABIC ">
+        <w:r>
+          <w:t>5</w:t>
+        </w:r>
+      </w:fldSimple>
+      <w:bookmarkEnd w:id="605"/>
+      <w:r>
+        <w:t xml:space="preserve">. Zaustavljanje pre drugog sabiranja u petlji</w:t>
+      </w:r>
+    </w:p>
+    <w:p>
+      <w:pPr>
+        <w:pStyle w:val="Osnovnitekst"/>
+      </w:pPr>
+      <w:r>
+        <w:rPr>
+          <w:lang w:val="sr-Latn-RS"/>
+        </w:rPr>
+        <w:t>Ponovni Run izvršava instrukciju na kojoj je program zaustavljen i nastavlja do sledećeg nailaska na tačku prekida. Tada su x1 i x2 jednaki 3, dok x3 ostaje 6. Tačka se uklanja ponovnim klikom na liniju ili dugmetom Breakpoint kada je marker na toj liniji, nakon čega Run može da dovrši program.</w:t>
+      </w:r>
+    </w:p>
+    <w:p>
+      <w:pPr>
+        <w:pStyle w:val="Osnovnitekst"/>
+      </w:pPr>
+      <w:r>
+        <w:rPr>
+          <w:lang w:val="sr-Latn-RS"/>
+        </w:rPr>
+        <w:t>Reset vraća registre i memoriju na nulu, a marker na početnu instrukciju. Prikaz upisivanih registara i memorijskih reči tada se prazni, ali učitani program i tačke prekida ostaju sačuvani. Izmeni se razlikuje od Reset-a: vraća uređivanje teksta i uklanja prethodno stanje izvršavanja i tačke prekida.</w:t>
+      </w:r>
+    </w:p>
+    <w:p>
+      <w:pPr>
+        <w:pStyle w:val="Poglavlje2"/>
+        <w:keepNext/>
+      </w:pPr>
+      <w:r>
+        <w:rPr>
+          <w:lang w:val="sr-Latn-RS"/>
+        </w:rPr>
+        <w:t>Prikaz registara, memorije i grešaka</w:t>
+      </w:r>
+    </w:p>
+    <w:p>
+      <w:pPr>
+        <w:pStyle w:val="Osnovnitekst"/>
+        <w:keepNext/>
+        <w:keepLines/>
+      </w:pPr>
+      <w:r>
+        <w:rPr>
+          <w:lang w:val="sr-Latn-RS"/>
+        </w:rPr>
+        <w:t xml:space="preserve">Po završetku programa x1 sadrži zbir 15, a x2 i x3 imaju vrednost 6. Reč na adresi 0000 prikazana je heksadecimalno kao 0000000F i decimalno kao 15, što potvrđuje upis rezultata. Završno stanje prikazano je na Slici </w:t>
+      </w:r>
+      <w:fldSimple w:instr=" REF Demo_result \h ">
+        <w:r>
+          <w:t>6</w:t>
+        </w:r>
+      </w:fldSimple>
+      <w:r>
+        <w:t xml:space="preserve">; marker više ne označava instrukciju, a Step i Run su onemogućeni.</w:t>
+      </w:r>
+    </w:p>
+    <w:p>
+      <w:pPr>
+        <w:pStyle w:val="Osnovnitekstneuvuen"/>
+        <w:jc w:val="center"/>
+        <w:keepNext/>
+      </w:pPr>
+      <w:r>
+        <w:rPr>
+          <w:lang w:val="sr-Latn-RS"/>
+        </w:rPr>
+        <w:t/>
+      </w:r>
+      <w:r>
+        <w:drawing>
+          <wp:inline xmlns:a="http://schemas.openxmlformats.org/drawingml/2006/main" xmlns:pic="http://schemas.openxmlformats.org/drawingml/2006/picture">
+            <wp:extent cx="6048248" cy="2721712"/>
+            <wp:docPr id="806" name="Picture 806"/>
+            <wp:cNvGraphicFramePr>
+              <a:graphicFrameLocks noChangeAspect="1"/>
+            </wp:cNvGraphicFramePr>
+            <a:graphic>
+              <a:graphicData uri="http://schemas.openxmlformats.org/drawingml/2006/picture">
+                <pic:pic>
+                  <pic:nvPicPr>
+                    <pic:cNvPr id="0" name="primer-rezultat.png"/>
+                    <pic:cNvPicPr/>
+                  </pic:nvPicPr>
+                  <pic:blipFill>
+                    <a:blip r:embed="rIdThesisDemo6"/>
+                    <a:stretch>
+                      <a:fillRect/>
+                    </a:stretch>
+                  </pic:blipFill>
+                  <pic:spPr>
+                    <a:xfrm>
+                      <a:off x="0" y="0"/>
+                      <a:ext cx="6048248" cy="2721712"/>
+                    </a:xfrm>
+                    <a:prstGeom prst="rect"/>
+                  </pic:spPr>
+                </pic:pic>
+              </a:graphicData>
+            </a:graphic>
+          </wp:inline>
+        </w:drawing>
+      </w:r>
+    </w:p>
+    <w:p>
+      <w:pPr>
+        <w:pStyle w:val="Natpis"/>
+        <w:keepLines/>
+      </w:pPr>
+      <w:r>
+        <w:rPr>
+          <w:lang w:val="sr-Latn-RS"/>
+        </w:rPr>
+        <w:t/>
+      </w:r>
+      <w:r>
+        <w:t xml:space="preserve">Slika </w:t>
+      </w:r>
+      <w:bookmarkStart w:id="606" w:name="Demo_result"/>
+      <w:fldSimple w:instr=" SEQ Slika \* ARABIC ">
+        <w:r>
+          <w:t>6</w:t>
+        </w:r>
+      </w:fldSimple>
+      <w:bookmarkEnd w:id="606"/>
+      <w:r>
+        <w:t xml:space="preserve">. Konačan rezultat u registrima i memoriji</w:t>
+      </w:r>
+    </w:p>
+    <w:p>
+      <w:pPr>
+        <w:pStyle w:val="Osnovnitekst"/>
+      </w:pPr>
+      <w:r>
+        <w:rPr>
+          <w:lang w:val="sr-Latn-RS"/>
+        </w:rPr>
+        <w:t>Primer pokazuje zašto su korisna oba zapisa vrednosti. Heksadecimalni zapis omogućava praćenje sadržaja 32-bitne reči, dok se iz decimalnog neposredno čita rezultat sabiranja. Memorijski panel prikazuje samo upisanu reč, a ne ceo prostor od 4096 bajtova.</w:t>
+      </w:r>
+    </w:p>
+    <w:p>
+      <w:pPr>
+        <w:pStyle w:val="Osnovnitekst"/>
+        <w:keepNext/>
+        <w:keepLines/>
+      </w:pPr>
+      <w:r>
+        <w:rPr>
+          <w:lang w:val="sr-Latn-RS"/>
+        </w:rPr>
+        <w:t xml:space="preserve">Za prikaz greške program se vraća u editor i naziv ADD u liniji 7 menja u MULT. Ponovno asembliranje prijavljuje poruku „Linija 7: nepoznata instrukcija 'MULT'”, prikazanu na Slici </w:t>
+      </w:r>
+      <w:fldSimple w:instr=" REF Demo_error \h ">
+        <w:r>
+          <w:t>7</w:t>
+        </w:r>
+      </w:fldSimple>
+      <w:r>
+        <w:t xml:space="preserve">. Aplikacija ostaje u režimu pisanja i ne dozvoljava izvršavanje dok se greška ne ispravi.</w:t>
+      </w:r>
+    </w:p>
+    <w:p>
+      <w:pPr>
+        <w:pStyle w:val="Osnovnitekstneuvuen"/>
+        <w:jc w:val="center"/>
+        <w:keepNext/>
+      </w:pPr>
+      <w:r>
+        <w:rPr>
+          <w:lang w:val="sr-Latn-RS"/>
+        </w:rPr>
+        <w:t/>
+      </w:r>
+      <w:r>
+        <w:drawing>
+          <wp:inline xmlns:a="http://schemas.openxmlformats.org/drawingml/2006/main" xmlns:pic="http://schemas.openxmlformats.org/drawingml/2006/picture">
+            <wp:extent cx="4536186" cy="2453535"/>
+            <wp:docPr id="807" name="Picture 807"/>
+            <wp:cNvGraphicFramePr>
+              <a:graphicFrameLocks noChangeAspect="1"/>
+            </wp:cNvGraphicFramePr>
+            <a:graphic>
+              <a:graphicData uri="http://schemas.openxmlformats.org/drawingml/2006/picture">
+                <pic:pic>
+                  <pic:nvPicPr>
+                    <pic:cNvPr id="0" name="primer-greska.png"/>
+                    <pic:cNvPicPr/>
+                  </pic:nvPicPr>
+                  <pic:blipFill>
+                    <a:blip r:embed="rIdThesisDemo7"/>
+                    <a:stretch>
+                      <a:fillRect/>
+                    </a:stretch>
+                  </pic:blipFill>
+                  <pic:spPr>
+                    <a:xfrm>
+                      <a:off x="0" y="0"/>
+                      <a:ext cx="4536186" cy="2453535"/>
+                    </a:xfrm>
+                    <a:prstGeom prst="rect"/>
+                  </pic:spPr>
+                </pic:pic>
+              </a:graphicData>
+            </a:graphic>
+          </wp:inline>
+        </w:drawing>
+      </w:r>
+    </w:p>
+    <w:p>
+      <w:pPr>
+        <w:pStyle w:val="Natpis"/>
+        <w:keepLines/>
+        <w:keepNext/>
+      </w:pPr>
+      <w:r>
+        <w:rPr>
+          <w:lang w:val="sr-Latn-RS"/>
+        </w:rPr>
+        <w:t/>
+      </w:r>
+      <w:r>
+        <w:t xml:space="preserve">Slika </w:t>
+      </w:r>
+      <w:bookmarkStart w:id="607" w:name="Demo_error"/>
+      <w:fldSimple w:instr=" SEQ Slika \* ARABIC ">
+        <w:r>
+          <w:t>7</w:t>
+        </w:r>
+      </w:fldSimple>
+      <w:bookmarkEnd w:id="607"/>
+      <w:r>
+        <w:t xml:space="preserve">. Greška nakon izmene naziva instrukcije</w:t>
+      </w:r>
+    </w:p>
+    <w:p>
+      <w:pPr>
+        <w:pStyle w:val="Osnovnitekst"/>
+        <w:keepLines/>
         <w:sectPr>
           <w:headerReference w:type="default" r:id="rId11"/>
           <w:footerReference w:type="default" r:id="rId12"/>
@@ -3603,7 +4245,7 @@
         <w:rPr>
           <w:lang w:val="sr-Latn-RS"/>
         </w:rPr>
-        <w:t>Primeri programa i kratka dokumentacija instrukcija izdvojeni su u posebne module. Oni dopunjuju interfejs, ali ne određuju pravila parsera, asemblera ili procesora. Time se razdvajaju prikaz, sadržaj namenjen korisniku i izvršna logika, a način korišćenja celog rešenja može zasebno da se prikaže u narednom poglavlju.</w:t>
+        <w:t>Greška može da nastane i tokom izvršavanja. Ako se u zasebnom programu unesu LI x1, 15 i zatim SW x1, 2(x0), asembliranje uspeva, ali Run prijavljuje da adresa 0x002 nije poravnata na 4 bajta. Registar x1 tada sadrži 15, memorija ostaje neizmenjena, a poruka upućuje na drugu liniju programa, gde je izvršavanje prekinuto.</w:t>
       </w:r>
     </w:p>
     <w:p>

</xml_diff>